<commit_message>
feat: deepen grounded retrieval and review workflows
</commit_message>
<xml_diff>
--- a/docs/manuals/generated/Prudentia-AI-Administrator-Manual.docx
+++ b/docs/manuals/generated/Prudentia-AI-Administrator-Manual.docx
@@ -21,7 +21,7 @@
         <w:rPr>
           <w:rFonts w:ascii="Calibri" w:hAnsi="Calibri"/>
         </w:rPr>
-        <w:t>Last updated: 2026-07-07</w:t>
+        <w:t>Last updated: 2026-07-18</w:t>
       </w:r>
     </w:p>
     <w:p>
@@ -2345,7 +2345,7 @@
         <w:rPr>
           <w:rFonts w:ascii="Calibri" w:hAnsi="Calibri"/>
         </w:rPr>
-        <w:t>7. Folder Sources</w:t>
+        <w:t>7. Abbreviation Glossary</w:t>
       </w:r>
     </w:p>
     <w:p>
@@ -2353,20 +2353,33 @@
         <w:rPr>
           <w:rFonts w:ascii="Calibri" w:hAnsi="Calibri"/>
         </w:rPr>
-        <w:t xml:space="preserve">Open </w:t>
+        <w:t xml:space="preserve">Platform Admins and System Admins can open </w:t>
       </w:r>
       <w:r>
         <w:rPr>
           <w:rFonts w:ascii="Calibri" w:hAnsi="Calibri"/>
           <w:b/>
         </w:rPr>
-        <w:t>Corpus &gt; Document Intake &gt; Folder Sources</w:t>
+        <w:t>Corpus &gt; Document Intake &gt; Abbreviation Glossary</w:t>
       </w:r>
       <w:r>
         <w:rPr>
           <w:rFonts w:ascii="Calibri" w:hAnsi="Calibri"/>
         </w:rPr>
-        <w:t xml:space="preserve"> to upload local folder snapshots for bulk ingestion.</w:t>
+        <w:t xml:space="preserve"> and use </w:t>
+      </w:r>
+      <w:r>
+        <w:rPr>
+          <w:rFonts w:ascii="Calibri" w:hAnsi="Calibri"/>
+          <w:b/>
+        </w:rPr>
+        <w:t>Terms in use</w:t>
+      </w:r>
+      <w:r>
+        <w:rPr>
+          <w:rFonts w:ascii="Calibri" w:hAnsi="Calibri"/>
+        </w:rPr>
+        <w:t xml:space="preserve"> to search, add, edit, or delete definitions. There is one global glossary; no Knowledge Space, sharing, or clearance selection is required. Saved changes become available to all queries immediately and do not re-index the document corpus.</w:t>
       </w:r>
     </w:p>
     <w:p>
@@ -2374,7 +2387,20 @@
         <w:rPr>
           <w:rFonts w:ascii="Calibri" w:hAnsi="Calibri"/>
         </w:rPr>
-        <w:t>Folder snapshots are one-time schedules. They do not continuously watch the local folder. To ingest later file edits, choose the folder again and create a new snapshot.</w:t>
+        <w:t xml:space="preserve">To import governed sources, upload one or more PDFs containing abbreviation and expansion pairs, either in two-column tables or as lines such as </w:t>
+      </w:r>
+      <w:r>
+        <w:rPr>
+          <w:rFonts w:ascii="Consolas" w:hAnsi="Consolas"/>
+          <w:sz w:val="19"/>
+        </w:rPr>
+        <w:t>AD — Assistant Director</w:t>
+      </w:r>
+      <w:r>
+        <w:rPr>
+          <w:rFonts w:ascii="Calibri" w:hAnsi="Calibri"/>
+        </w:rPr>
+        <w:t>. Definitions from active PDFs merge into the global glossary. Each PDF can be replaced or removed independently, and replacements do not affect other sources. Identical definitions may be shared by several PDFs; conflicting definitions fail activation and remain visible in ingestion activity for review. Source PDFs remain available for governance and audit, but are not embedded or searched as ordinary corpus documents.</w:t>
       </w:r>
     </w:p>
     <w:p>
@@ -2382,7 +2408,59 @@
         <w:rPr>
           <w:rFonts w:ascii="Calibri" w:hAnsi="Calibri"/>
         </w:rPr>
-        <w:t>Use run details to review queued, skipped, cancelled, and failed files. Unsupported files are recorded as skipped.</w:t>
+        <w:t xml:space="preserve">Query expansion works in both directions: </w:t>
+      </w:r>
+      <w:r>
+        <w:rPr>
+          <w:rFonts w:ascii="Consolas" w:hAnsi="Consolas"/>
+          <w:sz w:val="19"/>
+        </w:rPr>
+        <w:t>AD</w:t>
+      </w:r>
+      <w:r>
+        <w:rPr>
+          <w:rFonts w:ascii="Calibri" w:hAnsi="Calibri"/>
+        </w:rPr>
+        <w:t xml:space="preserve"> adds </w:t>
+      </w:r>
+      <w:r>
+        <w:rPr>
+          <w:rFonts w:ascii="Consolas" w:hAnsi="Consolas"/>
+          <w:sz w:val="19"/>
+        </w:rPr>
+        <w:t>Assistant Director</w:t>
+      </w:r>
+      <w:r>
+        <w:rPr>
+          <w:rFonts w:ascii="Calibri" w:hAnsi="Calibri"/>
+        </w:rPr>
+        <w:t xml:space="preserve">, while </w:t>
+      </w:r>
+      <w:r>
+        <w:rPr>
+          <w:rFonts w:ascii="Consolas" w:hAnsi="Consolas"/>
+          <w:sz w:val="19"/>
+        </w:rPr>
+        <w:t>Assistant Director</w:t>
+      </w:r>
+      <w:r>
+        <w:rPr>
+          <w:rFonts w:ascii="Calibri" w:hAnsi="Calibri"/>
+        </w:rPr>
+        <w:t xml:space="preserve"> adds </w:t>
+      </w:r>
+      <w:r>
+        <w:rPr>
+          <w:rFonts w:ascii="Consolas" w:hAnsi="Consolas"/>
+          <w:sz w:val="19"/>
+        </w:rPr>
+        <w:t>AD</w:t>
+      </w:r>
+      <w:r>
+        <w:rPr>
+          <w:rFonts w:ascii="Calibri" w:hAnsi="Calibri"/>
+        </w:rPr>
+        <w:t>. The original user text remains unchanged for display and audit. Ambiguous definitions are not expanded automatically. When a PDF definition supports an answer, its evidence records the source PDF and page without exposing unrelated glossary content to retrieval.</w:t>
       </w:r>
     </w:p>
     <w:p>
@@ -2393,7 +2471,82 @@
         <w:rPr>
           <w:rFonts w:ascii="Calibri" w:hAnsi="Calibri"/>
         </w:rPr>
-        <w:t>8. Database Connectors</w:t>
+        <w:t>8. Folder Sources</w:t>
+      </w:r>
+    </w:p>
+    <w:p>
+      <w:r>
+        <w:rPr>
+          <w:rFonts w:ascii="Calibri" w:hAnsi="Calibri"/>
+        </w:rPr>
+        <w:t xml:space="preserve">Open </w:t>
+      </w:r>
+      <w:r>
+        <w:rPr>
+          <w:rFonts w:ascii="Calibri" w:hAnsi="Calibri"/>
+          <w:b/>
+        </w:rPr>
+        <w:t>Corpus &gt; Document Intake &gt; Folder Sources</w:t>
+      </w:r>
+      <w:r>
+        <w:rPr>
+          <w:rFonts w:ascii="Calibri" w:hAnsi="Calibri"/>
+        </w:rPr>
+        <w:t xml:space="preserve"> to upload local folder snapshots for bulk ingestion.</w:t>
+      </w:r>
+    </w:p>
+    <w:p>
+      <w:r>
+        <w:rPr>
+          <w:rFonts w:ascii="Calibri" w:hAnsi="Calibri"/>
+        </w:rPr>
+        <w:t>Folder snapshots are one-time schedules. They do not continuously watch the local folder. To ingest later file edits, choose the folder again and create a new snapshot.</w:t>
+      </w:r>
+    </w:p>
+    <w:p>
+      <w:r>
+        <w:rPr>
+          <w:rFonts w:ascii="Calibri" w:hAnsi="Calibri"/>
+        </w:rPr>
+        <w:t>Use run details to review queued, skipped, cancelled, and failed files. Unsupported files are recorded as skipped.</w:t>
+      </w:r>
+    </w:p>
+    <w:p>
+      <w:pPr>
+        <w:pStyle w:val="Heading3"/>
+      </w:pPr>
+      <w:r>
+        <w:rPr>
+          <w:rFonts w:ascii="Calibri" w:hAnsi="Calibri"/>
+        </w:rPr>
+        <w:t>Document Health Count Semantics</w:t>
+      </w:r>
+    </w:p>
+    <w:p>
+      <w:r>
+        <w:rPr>
+          <w:rFonts w:ascii="Calibri" w:hAnsi="Calibri"/>
+        </w:rPr>
+        <w:t>Document Overview, Knowledge Spaces, Workspace Summary, and the Trash badge use the same access- and clearance-filtered document snapshot. Counts are grouped by persisted document identity, not by ingestion attempts or browser upload rows. Needs attention is the distinct set of visible current documents in failed, unknown, or human-review state. Processing is separate, cancelled is excluded, and superseded versions do not contribute current health.</w:t>
+      </w:r>
+    </w:p>
+    <w:p>
+      <w:r>
+        <w:rPr>
+          <w:rFonts w:ascii="Calibri" w:hAnsi="Calibri"/>
+        </w:rPr>
+        <w:t>A retry updates the existing document state, so failed becomes processing and does not stack another issue. A new unrelated upload is a different document and does not acknowledge the original failure. A replacement leaves the old version current until successful publication, then moves the old version to Superseded. Use Activity and Ingestion Health for run and attempt counts; their totals intentionally differ from document-health totals.</w:t>
+      </w:r>
+    </w:p>
+    <w:p>
+      <w:pPr>
+        <w:pStyle w:val="Heading2"/>
+      </w:pPr>
+      <w:r>
+        <w:rPr>
+          <w:rFonts w:ascii="Calibri" w:hAnsi="Calibri"/>
+        </w:rPr>
+        <w:t>9. Database Connectors</w:t>
       </w:r>
     </w:p>
     <w:p>
@@ -2467,14 +2620,24 @@
       </w:r>
     </w:p>
     <w:p>
-      <w:pPr>
-        <w:pStyle w:val="ListNumber"/>
-      </w:pPr>
       <w:r>
         <w:rPr>
           <w:rFonts w:ascii="Calibri" w:hAnsi="Calibri"/>
         </w:rPr>
-        <w:t>Add a connection profile with a least-privilege read-only database account.</w:t>
+        <w:t xml:space="preserve">Selecting an action for a saved connection activates its guided setup. Each successful stage advances to the next workspace automatically; completed stages remain selectable for review, and </w:t>
+      </w:r>
+      <w:r>
+        <w:rPr>
+          <w:rFonts w:ascii="Calibri" w:hAnsi="Calibri"/>
+          <w:b/>
+        </w:rPr>
+        <w:t>All Connections</w:t>
+      </w:r>
+      <w:r>
+        <w:rPr>
+          <w:rFonts w:ascii="Calibri" w:hAnsi="Calibri"/>
+        </w:rPr>
+        <w:t xml:space="preserve"> returns to the overview.</w:t>
       </w:r>
     </w:p>
     <w:p>
@@ -2485,7 +2648,7 @@
         <w:rPr>
           <w:rFonts w:ascii="Calibri" w:hAnsi="Calibri"/>
         </w:rPr>
-        <w:t>Save the encrypted profile.</w:t>
+        <w:t>Add and save a connection with a least-privilege read-only database account.</w:t>
       </w:r>
     </w:p>
     <w:p>
@@ -2496,7 +2659,20 @@
         <w:rPr>
           <w:rFonts w:ascii="Calibri" w:hAnsi="Calibri"/>
         </w:rPr>
-        <w:t>Test the profile.</w:t>
+        <w:t xml:space="preserve">Follow the connection's primary action to </w:t>
+      </w:r>
+      <w:r>
+        <w:rPr>
+          <w:rFonts w:ascii="Calibri" w:hAnsi="Calibri"/>
+          <w:b/>
+        </w:rPr>
+        <w:t>Test Connection</w:t>
+      </w:r>
+      <w:r>
+        <w:rPr>
+          <w:rFonts w:ascii="Calibri" w:hAnsi="Calibri"/>
+        </w:rPr>
+        <w:t>.</w:t>
       </w:r>
     </w:p>
     <w:p>
@@ -2507,7 +2683,7 @@
         <w:rPr>
           <w:rFonts w:ascii="Calibri" w:hAnsi="Calibri"/>
         </w:rPr>
-        <w:t xml:space="preserve">Select </w:t>
+        <w:t xml:space="preserve">After a successful test, select </w:t>
       </w:r>
       <w:r>
         <w:rPr>
@@ -2531,20 +2707,20 @@
         <w:rPr>
           <w:rFonts w:ascii="Calibri" w:hAnsi="Calibri"/>
         </w:rPr>
-        <w:t xml:space="preserve">Select </w:t>
+        <w:t xml:space="preserve">Inspect the snapshot, explicitly select its owner Knowledge Space and clearance, and choose </w:t>
       </w:r>
       <w:r>
         <w:rPr>
           <w:rFonts w:ascii="Calibri" w:hAnsi="Calibri"/>
           <w:b/>
         </w:rPr>
-        <w:t>Prepare Review</w:t>
+        <w:t>Prepare AI-assisted review</w:t>
       </w:r>
       <w:r>
         <w:rPr>
           <w:rFonts w:ascii="Calibri" w:hAnsi="Calibri"/>
         </w:rPr>
-        <w:t xml:space="preserve"> to create a reviewable schema catalog.</w:t>
+        <w:t>.</w:t>
       </w:r>
     </w:p>
     <w:p>
@@ -2555,7 +2731,20 @@
         <w:rPr>
           <w:rFonts w:ascii="Calibri" w:hAnsi="Calibri"/>
         </w:rPr>
-        <w:t>Review table and column descriptions, synonyms, relationships, business rules, allowed fields, and sensitivity flags.</w:t>
+        <w:t xml:space="preserve">Prudentia creates an editable review and proposes descriptions, synonyms, join context, and business rules from schema metadata, one table at a time. Completed tables are saved; use </w:t>
+      </w:r>
+      <w:r>
+        <w:rPr>
+          <w:rFonts w:ascii="Calibri" w:hAnsi="Calibri"/>
+          <w:b/>
+        </w:rPr>
+        <w:t>Continue AI Enrichment</w:t>
+      </w:r>
+      <w:r>
+        <w:rPr>
+          <w:rFonts w:ascii="Calibri" w:hAnsi="Calibri"/>
+        </w:rPr>
+        <w:t xml:space="preserve"> after an interruption.</w:t>
       </w:r>
     </w:p>
     <w:p>
@@ -2566,7 +2755,7 @@
         <w:rPr>
           <w:rFonts w:ascii="Calibri" w:hAnsi="Calibri"/>
         </w:rPr>
-        <w:t>Assign the owner Knowledge Space, optional shared Knowledge Spaces, and clearance.</w:t>
+        <w:t>Follow the guided Summary, Tables, Joins, and Access review. Correct table and column descriptions, synonyms, relationships, business rules, allowed fields, and sensitivity flags.</w:t>
       </w:r>
     </w:p>
     <w:p>
@@ -2577,20 +2766,7 @@
         <w:rPr>
           <w:rFonts w:ascii="Calibri" w:hAnsi="Calibri"/>
         </w:rPr>
-        <w:t xml:space="preserve">Select </w:t>
-      </w:r>
-      <w:r>
-        <w:rPr>
-          <w:rFonts w:ascii="Calibri" w:hAnsi="Calibri"/>
-          <w:b/>
-        </w:rPr>
-        <w:t>Continue AI Enrichment</w:t>
-      </w:r>
-      <w:r>
-        <w:rPr>
-          <w:rFonts w:ascii="Calibri" w:hAnsi="Calibri"/>
-        </w:rPr>
-        <w:t xml:space="preserve"> if enrichment has not finished.</w:t>
+        <w:t>Assign the owner Knowledge Space, optional shared Knowledge Spaces, and clearance.</w:t>
       </w:r>
     </w:p>
     <w:p>
@@ -2614,7 +2790,7 @@
         <w:rPr>
           <w:rFonts w:ascii="Calibri" w:hAnsi="Calibri"/>
         </w:rPr>
-        <w:t xml:space="preserve"> while drafting or while waiting for review.</w:t>
+        <w:t xml:space="preserve"> to preserve the current review state.</w:t>
       </w:r>
     </w:p>
     <w:p>
@@ -2638,7 +2814,28 @@
         <w:rPr>
           <w:rFonts w:ascii="Calibri" w:hAnsi="Calibri"/>
         </w:rPr>
-        <w:t xml:space="preserve"> only after human review is complete.</w:t>
+        <w:t xml:space="preserve"> only after human review is complete. A successful approval advances the workspace to </w:t>
+      </w:r>
+      <w:r>
+        <w:rPr>
+          <w:rFonts w:ascii="Calibri" w:hAnsi="Calibri"/>
+          <w:b/>
+        </w:rPr>
+        <w:t>Live Access</w:t>
+      </w:r>
+      <w:r>
+        <w:rPr>
+          <w:rFonts w:ascii="Calibri" w:hAnsi="Calibri"/>
+        </w:rPr>
+        <w:t>.</w:t>
+      </w:r>
+    </w:p>
+    <w:p>
+      <w:r>
+        <w:rPr>
+          <w:rFonts w:ascii="Calibri" w:hAnsi="Calibri"/>
+        </w:rPr>
+        <w:t>AI enrichment supplies editable suggestions only and does not inspect row values. It cannot approve a catalog, change its access scope, or enable Live DB access.</w:t>
       </w:r>
     </w:p>
     <w:p>
@@ -2657,7 +2854,7 @@
         <w:rPr>
           <w:rFonts w:ascii="Calibri" w:hAnsi="Calibri"/>
         </w:rPr>
-        <w:t>9. Review Queue Administration</w:t>
+        <w:t>10. Review Queue Administration</w:t>
       </w:r>
     </w:p>
     <w:p>
@@ -2679,6 +2876,27 @@
           <w:rFonts w:ascii="Calibri" w:hAnsi="Calibri"/>
         </w:rPr>
         <w:t>.</w:t>
+      </w:r>
+    </w:p>
+    <w:p>
+      <w:r>
+        <w:rPr>
+          <w:rFonts w:ascii="Calibri" w:hAnsi="Calibri"/>
+        </w:rPr>
+        <w:t xml:space="preserve">The sidebar badge counts distinct, visible documents with pending OCR or PDF image review work. It does not count individual blocks or images, and partial decisions keep the document counted. The document leaves the count when its last pending review item is approved, rejected, skipped, or closed by cancellation. </w:t>
+      </w:r>
+      <w:r>
+        <w:rPr>
+          <w:rFonts w:ascii="Calibri" w:hAnsi="Calibri"/>
+          <w:b/>
+        </w:rPr>
+        <w:t>Activity</w:t>
+      </w:r>
+      <w:r>
+        <w:rPr>
+          <w:rFonts w:ascii="Calibri" w:hAnsi="Calibri"/>
+        </w:rPr>
+        <w:t xml:space="preserve"> remains an unbadged operational history.</w:t>
       </w:r>
     </w:p>
     <w:p>
@@ -2780,7 +2998,7 @@
         <w:rPr>
           <w:rFonts w:ascii="Calibri" w:hAnsi="Calibri"/>
         </w:rPr>
-        <w:t>10. RAG Evaluation</w:t>
+        <w:t>11. RAG Evaluation</w:t>
       </w:r>
     </w:p>
     <w:p>
@@ -3137,7 +3355,7 @@
         <w:rPr>
           <w:rFonts w:ascii="Calibri" w:hAnsi="Calibri"/>
         </w:rPr>
-        <w:t>11. Runtime Settings</w:t>
+        <w:t>12. Runtime Settings</w:t>
       </w:r>
     </w:p>
     <w:p>
@@ -3198,6 +3416,40 @@
           <w:rFonts w:ascii="Calibri" w:hAnsi="Calibri"/>
         </w:rPr>
         <w:t>.</w:t>
+      </w:r>
+    </w:p>
+    <w:p>
+      <w:r>
+        <w:rPr>
+          <w:rFonts w:ascii="Calibri" w:hAnsi="Calibri"/>
+        </w:rPr>
+        <w:t xml:space="preserve">The Evidence token budget is a workspace maximum. Query routes use smaller source-count and token limits for factual, comparison, and multi-hop answers to bound latency while preserving one available result per planned subquery. Confident factual routes rerank up to 12 candidates; uncertain implicit hybrid source routes widen that pool to 20 under the operator ceiling. Deployment operators can additionally bound local cross-encoder work with </w:t>
+      </w:r>
+      <w:r>
+        <w:rPr>
+          <w:rFonts w:ascii="Consolas" w:hAnsi="Consolas"/>
+          <w:sz w:val="19"/>
+        </w:rPr>
+        <w:t>RAG_RERANKER_MAX_CANDIDATES</w:t>
+      </w:r>
+      <w:r>
+        <w:rPr>
+          <w:rFonts w:ascii="Calibri" w:hAnsi="Calibri"/>
+        </w:rPr>
+        <w:t xml:space="preserve"> and </w:t>
+      </w:r>
+      <w:r>
+        <w:rPr>
+          <w:rFonts w:ascii="Consolas" w:hAnsi="Consolas"/>
+          <w:sz w:val="19"/>
+        </w:rPr>
+        <w:t>RAG_RERANKER_TIMEOUT_SECONDS</w:t>
+      </w:r>
+      <w:r>
+        <w:rPr>
+          <w:rFonts w:ascii="Calibri" w:hAnsi="Calibri"/>
+        </w:rPr>
+        <w:t>. Exhaustive queries use a larger bounded budget and report partial coverage rather than claiming completeness when the available budget is insufficient.</w:t>
       </w:r>
     </w:p>
     <w:p>
@@ -3740,7 +3992,7 @@
         <w:rPr>
           <w:rFonts w:ascii="Calibri" w:hAnsi="Calibri"/>
         </w:rPr>
-        <w:t>Tune budgets, timeouts, model thinking, and the query planner.</w:t>
+        <w:t>Tune budgets, model thinking, the query planner, and the separate timeouts for answer synthesis, reasoning, routing, faithfulness, and embeddings.</w:t>
       </w:r>
     </w:p>
     <w:p>
@@ -3800,43 +4052,50 @@
       </w:r>
     </w:p>
     <w:p>
-      <w:pPr>
-        <w:pStyle w:val="Heading3"/>
-      </w:pPr>
       <w:r>
         <w:rPr>
           <w:rFonts w:ascii="Calibri" w:hAnsi="Calibri"/>
         </w:rPr>
-        <w:t>Inference Services</w:t>
-      </w:r>
-    </w:p>
-    <w:p>
-      <w:r>
-        <w:rPr>
-          <w:rFonts w:ascii="Calibri" w:hAnsi="Calibri"/>
-        </w:rPr>
-        <w:t xml:space="preserve">Use </w:t>
+        <w:t xml:space="preserve">To run without LLM-based answer judging, set both </w:t>
       </w:r>
       <w:r>
         <w:rPr>
           <w:rFonts w:ascii="Calibri" w:hAnsi="Calibri"/>
           <w:b/>
         </w:rPr>
-        <w:t>Inference Services</w:t>
+        <w:t>Evidence Gate</w:t>
       </w:r>
       <w:r>
         <w:rPr>
           <w:rFonts w:ascii="Calibri" w:hAnsi="Calibri"/>
         </w:rPr>
-        <w:t xml:space="preserve"> to check provider availability and manage vLLM launch limits. Applying vLLM limits restarts only the selected vLLM service and interrupts requests using that service.</w:t>
-      </w:r>
-    </w:p>
-    <w:p>
+        <w:t xml:space="preserve"> and </w:t>
+      </w:r>
       <w:r>
         <w:rPr>
           <w:rFonts w:ascii="Calibri" w:hAnsi="Calibri"/>
-        </w:rPr>
-        <w:t>Do not switch the active provider to vLLM unless the vLLM services and model caches are actually available. In the default Windows airgapped rollout, Ollama is the expected provider until vLLM is deliberately enabled.</w:t>
+          <w:b/>
+        </w:rPr>
+        <w:t>Faithfulness checker</w:t>
+      </w:r>
+      <w:r>
+        <w:rPr>
+          <w:rFonts w:ascii="Calibri" w:hAnsi="Calibri"/>
+        </w:rPr>
+        <w:t xml:space="preserve"> to </w:t>
+      </w:r>
+      <w:r>
+        <w:rPr>
+          <w:rFonts w:ascii="Calibri" w:hAnsi="Calibri"/>
+          <w:b/>
+        </w:rPr>
+        <w:t>Never</w:t>
+      </w:r>
+      <w:r>
+        <w:rPr>
+          <w:rFonts w:ascii="Calibri" w:hAnsi="Calibri"/>
+        </w:rPr>
+        <w:t>. The deterministic retrieval verifier, reranker, citation checks, and access controls still run, but uncertain evidence and generated claims are no longer reviewed by an LLM. Use this lower-latency mode only when that quality tradeoff is acceptable. Evaluation jobs may explicitly force faithfulness checking to measure answer quality.</w:t>
       </w:r>
     </w:p>
     <w:p>
@@ -3847,6 +4106,46 @@
         <w:rPr>
           <w:rFonts w:ascii="Calibri" w:hAnsi="Calibri"/>
         </w:rPr>
+        <w:t>Inference Services</w:t>
+      </w:r>
+    </w:p>
+    <w:p>
+      <w:r>
+        <w:rPr>
+          <w:rFonts w:ascii="Calibri" w:hAnsi="Calibri"/>
+        </w:rPr>
+        <w:t xml:space="preserve">Use </w:t>
+      </w:r>
+      <w:r>
+        <w:rPr>
+          <w:rFonts w:ascii="Calibri" w:hAnsi="Calibri"/>
+          <w:b/>
+        </w:rPr>
+        <w:t>Inference Services</w:t>
+      </w:r>
+      <w:r>
+        <w:rPr>
+          <w:rFonts w:ascii="Calibri" w:hAnsi="Calibri"/>
+        </w:rPr>
+        <w:t xml:space="preserve"> to check provider availability and manage vLLM launch limits. Applying vLLM limits restarts only the selected vLLM service and interrupts requests using that service.</w:t>
+      </w:r>
+    </w:p>
+    <w:p>
+      <w:r>
+        <w:rPr>
+          <w:rFonts w:ascii="Calibri" w:hAnsi="Calibri"/>
+        </w:rPr>
+        <w:t>Do not switch the active provider to vLLM unless the vLLM services and model caches are actually available. In the default Windows airgapped rollout, Ollama is the expected provider until vLLM is deliberately enabled.</w:t>
+      </w:r>
+    </w:p>
+    <w:p>
+      <w:pPr>
+        <w:pStyle w:val="Heading3"/>
+      </w:pPr>
+      <w:r>
+        <w:rPr>
+          <w:rFonts w:ascii="Calibri" w:hAnsi="Calibri"/>
+        </w:rPr>
         <w:t>Ingestion Controls</w:t>
       </w:r>
     </w:p>
@@ -3895,7 +4194,7 @@
         <w:rPr>
           <w:rFonts w:ascii="Calibri" w:hAnsi="Calibri"/>
         </w:rPr>
-        <w:t>12. System Audit</w:t>
+        <w:t>13. System Audit</w:t>
       </w:r>
     </w:p>
     <w:p>
@@ -4044,7 +4343,7 @@
         <w:rPr>
           <w:rFonts w:ascii="Calibri" w:hAnsi="Calibri"/>
         </w:rPr>
-        <w:t>13. Admin Troubleshooting</w:t>
+        <w:t>14. Admin Troubleshooting</w:t>
       </w:r>
     </w:p>
     <w:tbl>
@@ -4719,7 +5018,7 @@
         <w:rPr>
           <w:rFonts w:ascii="Calibri" w:hAnsi="Calibri"/>
         </w:rPr>
-        <w:t>14. Admin Safety Rules</w:t>
+        <w:t>15. Admin Safety Rules</w:t>
       </w:r>
     </w:p>
     <w:p>

</xml_diff>

<commit_message>
feat: update RAG ingestion, query analytics, and document workflows
</commit_message>
<xml_diff>
--- a/docs/manuals/generated/Prudentia-AI-Administrator-Manual.docx
+++ b/docs/manuals/generated/Prudentia-AI-Administrator-Manual.docx
@@ -1717,7 +1717,20 @@
         <w:rPr>
           <w:rFonts w:ascii="Calibri" w:hAnsi="Calibri"/>
         </w:rPr>
-        <w:t xml:space="preserve"> for your own password.</w:t>
+        <w:t xml:space="preserve"> for your own password or email address. Platform Admins can update another user's email from </w:t>
+      </w:r>
+      <w:r>
+        <w:rPr>
+          <w:rFonts w:ascii="Calibri" w:hAnsi="Calibri"/>
+          <w:b/>
+        </w:rPr>
+        <w:t>User Management</w:t>
+      </w:r>
+      <w:r>
+        <w:rPr>
+          <w:rFonts w:ascii="Calibri" w:hAnsi="Calibri"/>
+        </w:rPr>
+        <w:t>; that ends the user's signed-in sessions.</w:t>
       </w:r>
     </w:p>
     <w:p>
@@ -2387,7 +2400,7 @@
         <w:rPr>
           <w:rFonts w:ascii="Calibri" w:hAnsi="Calibri"/>
         </w:rPr>
-        <w:t xml:space="preserve">To import governed sources, upload one or more PDFs containing abbreviation and expansion pairs, either in two-column tables or as lines such as </w:t>
+        <w:t xml:space="preserve">To import governed sources, upload one or more PDFs containing abbreviation and expansion pairs, either in two-column tables—with or without headers—or as lines such as </w:t>
       </w:r>
       <w:r>
         <w:rPr>
@@ -2400,7 +2413,33 @@
         <w:rPr>
           <w:rFonts w:ascii="Calibri" w:hAnsi="Calibri"/>
         </w:rPr>
-        <w:t>. Definitions from active PDFs merge into the global glossary. Each PDF can be replaced or removed independently, and replacements do not affect other sources. Identical definitions may be shared by several PDFs; conflicting definitions fail activation and remain visible in ingestion activity for review. Source PDFs remain available for governance and audit, but are not embedded or searched as ordinary corpus documents.</w:t>
+        <w:t xml:space="preserve">. Headerless rows may use whitespace between the abbreviation and expansion, such as </w:t>
+      </w:r>
+      <w:r>
+        <w:rPr>
+          <w:rFonts w:ascii="Consolas" w:hAnsi="Consolas"/>
+          <w:sz w:val="19"/>
+        </w:rPr>
+        <w:t>AD Assistant Director</w:t>
+      </w:r>
+      <w:r>
+        <w:rPr>
+          <w:rFonts w:ascii="Calibri" w:hAnsi="Calibri"/>
+        </w:rPr>
+        <w:t xml:space="preserve">. Definitions from active PDFs merge into the global glossary. Each PDF can be replaced or moved to Trash independently, and replacements do not affect other sources. A single abbreviation can have multiple definitions; ambiguous abbreviations expand in Chat with each definition joined by </w:t>
+      </w:r>
+      <w:r>
+        <w:rPr>
+          <w:rFonts w:ascii="Consolas" w:hAnsi="Consolas"/>
+          <w:sz w:val="19"/>
+        </w:rPr>
+        <w:t>OR</w:t>
+      </w:r>
+      <w:r>
+        <w:rPr>
+          <w:rFonts w:ascii="Calibri" w:hAnsi="Calibri"/>
+        </w:rPr>
+        <w:t>. Identical definitions may be shared by several PDFs. Source PDFs remain available for governance and audit, but are not embedded or searched as ordinary corpus documents. Their processing status stays in the Abbreviation Glossary workflow and does not appear in normal ingestion activity or health summaries.</w:t>
       </w:r>
     </w:p>
     <w:p>
@@ -2460,7 +2499,80 @@
         <w:rPr>
           <w:rFonts w:ascii="Calibri" w:hAnsi="Calibri"/>
         </w:rPr>
-        <w:t>. The original user text remains unchanged for display and audit. Ambiguous definitions are not expanded automatically. When a PDF definition supports an answer, its evidence records the source PDF and page without exposing unrelated glossary content to retrieval.</w:t>
+        <w:t xml:space="preserve">. The original user text remains unchanged for display and audit. Ambiguous abbreviations include every definition joined by </w:t>
+      </w:r>
+      <w:r>
+        <w:rPr>
+          <w:rFonts w:ascii="Consolas" w:hAnsi="Consolas"/>
+          <w:sz w:val="19"/>
+        </w:rPr>
+        <w:t>OR</w:t>
+      </w:r>
+      <w:r>
+        <w:rPr>
+          <w:rFonts w:ascii="Calibri" w:hAnsi="Calibri"/>
+        </w:rPr>
+        <w:t>. When a PDF definition supports an answer, its evidence records the source PDF and page without exposing unrelated glossary content to retrieval.</w:t>
+      </w:r>
+    </w:p>
+    <w:p>
+      <w:r>
+        <w:rPr>
+          <w:rFonts w:ascii="Calibri" w:hAnsi="Calibri"/>
+        </w:rPr>
+        <w:t xml:space="preserve">Glossary PDFs and their processing status remain in the </w:t>
+      </w:r>
+      <w:r>
+        <w:rPr>
+          <w:rFonts w:ascii="Calibri" w:hAnsi="Calibri"/>
+          <w:b/>
+        </w:rPr>
+        <w:t>Abbreviation Glossary</w:t>
+      </w:r>
+      <w:r>
+        <w:rPr>
+          <w:rFonts w:ascii="Calibri" w:hAnsi="Calibri"/>
+        </w:rPr>
+        <w:t xml:space="preserve"> workflow. Use </w:t>
+      </w:r>
+      <w:r>
+        <w:rPr>
+          <w:rFonts w:ascii="Calibri" w:hAnsi="Calibri"/>
+          <w:b/>
+        </w:rPr>
+        <w:t>Terms &amp; sources</w:t>
+      </w:r>
+      <w:r>
+        <w:rPr>
+          <w:rFonts w:ascii="Calibri" w:hAnsi="Calibri"/>
+        </w:rPr>
+        <w:t xml:space="preserve"> for active definitions and source files, and </w:t>
+      </w:r>
+      <w:r>
+        <w:rPr>
+          <w:rFonts w:ascii="Calibri" w:hAnsi="Calibri"/>
+          <w:b/>
+        </w:rPr>
+        <w:t>Activity</w:t>
+      </w:r>
+      <w:r>
+        <w:rPr>
+          <w:rFonts w:ascii="Calibri" w:hAnsi="Calibri"/>
+        </w:rPr>
+        <w:t xml:space="preserve"> for queued, running, completed, cancelled, or failed imports. They do not appear in the ordinary document list or normal ingestion Activity. Removed and failed sources appear in the shared </w:t>
+      </w:r>
+      <w:r>
+        <w:rPr>
+          <w:rFonts w:ascii="Calibri" w:hAnsi="Calibri"/>
+          <w:b/>
+        </w:rPr>
+        <w:t>Trash</w:t>
+      </w:r>
+      <w:r>
+        <w:rPr>
+          <w:rFonts w:ascii="Calibri" w:hAnsi="Calibri"/>
+        </w:rPr>
+        <w:t>, where an authorized administrator can restore or permanently delete them.</w:t>
       </w:r>
     </w:p>
     <w:p>
@@ -2508,6 +2620,48 @@
         <w:rPr>
           <w:rFonts w:ascii="Calibri" w:hAnsi="Calibri"/>
         </w:rPr>
+        <w:t xml:space="preserve">PDF, DOCX, PPTX, CSV, XLSX, JPG, PNG, and JSON files are accepted. </w:t>
+      </w:r>
+      <w:r>
+        <w:rPr>
+          <w:rFonts w:ascii="Calibri" w:hAnsi="Calibri"/>
+          <w:b/>
+        </w:rPr>
+        <w:t>Analyze slide visuals</w:t>
+      </w:r>
+      <w:r>
+        <w:rPr>
+          <w:rFonts w:ascii="Calibri" w:hAnsi="Calibri"/>
+        </w:rPr>
+        <w:t xml:space="preserve"> defaults to enabled and is saved with the schedule, so PPTX slides retain diagram, chart, image, and layout meaning during ingestion.</w:t>
+      </w:r>
+    </w:p>
+    <w:p>
+      <w:r>
+        <w:rPr>
+          <w:rFonts w:ascii="Calibri" w:hAnsi="Calibri"/>
+        </w:rPr>
+        <w:t xml:space="preserve">Spreadsheet ingestion detects title rows and grouped headers, indexes each visible, non-empty worksheet, and skips hidden worksheets. Authorized users can correct the result from the document inspector's </w:t>
+      </w:r>
+      <w:r>
+        <w:rPr>
+          <w:rFonts w:ascii="Calibri" w:hAnsi="Calibri"/>
+          <w:b/>
+        </w:rPr>
+        <w:t>Tables</w:t>
+      </w:r>
+      <w:r>
+        <w:rPr>
+          <w:rFonts w:ascii="Calibri" w:hAnsi="Calibri"/>
+        </w:rPr>
+        <w:t xml:space="preserve"> tab; saving queues reindexing while preserving the original file. Spreadsheet formulas are preserved as source expressions and are never calculated by ingestion.</w:t>
+      </w:r>
+    </w:p>
+    <w:p>
+      <w:r>
+        <w:rPr>
+          <w:rFonts w:ascii="Calibri" w:hAnsi="Calibri"/>
+        </w:rPr>
         <w:t>Use run details to review queued, skipped, cancelled, and failed files. Unsupported files are recorded as skipped.</w:t>
       </w:r>
     </w:p>
@@ -2527,7 +2681,7 @@
         <w:rPr>
           <w:rFonts w:ascii="Calibri" w:hAnsi="Calibri"/>
         </w:rPr>
-        <w:t>Document Overview, Knowledge Spaces, Workspace Summary, and the Trash badge use the same access- and clearance-filtered document snapshot. Counts are grouped by persisted document identity, not by ingestion attempts or browser upload rows. Needs attention is the distinct set of visible current documents in failed, unknown, or human-review state. Processing is separate, cancelled is excluded, and superseded versions do not contribute current health.</w:t>
+        <w:t>Document Overview, Knowledge Spaces, System Overview, and the Trash badge use the same access- and clearance-filtered document snapshot. Counts are grouped by persisted document identity, not by ingestion attempts or browser upload rows. Needs attention is the distinct set of visible current documents in failed, unknown, or human-review state. Processing is separate, cancelled is excluded, and superseded versions do not contribute current health.</w:t>
       </w:r>
     </w:p>
     <w:p>
@@ -2755,7 +2909,7 @@
         <w:rPr>
           <w:rFonts w:ascii="Calibri" w:hAnsi="Calibri"/>
         </w:rPr>
-        <w:t>Follow the guided Summary, Tables, Joins, and Access review. Correct table and column descriptions, synonyms, relationships, business rules, allowed fields, and sensitivity flags.</w:t>
+        <w:t>Follow the guided Summary, Tables, Joins, and Access review. Add a clear database description, business domains, entities, metrics, synonyms, representative questions, and exclusions. Correct table and column descriptions, relationships, business rules, allowed fields, and sensitivity flags. Add verified exact-question/read-only-SQL pairs for recurring canonical questions that should bypass model SQL generation.</w:t>
       </w:r>
     </w:p>
     <w:p>
@@ -2847,6 +3001,14 @@
       </w:r>
     </w:p>
     <w:p>
+      <w:r>
+        <w:rPr>
+          <w:rFonts w:ascii="Calibri" w:hAnsi="Calibri"/>
+        </w:rPr>
+        <w:t>Live DB routes only across sources already authorized for the requesting user and selects one catalog before SQL generation. The configured Routing role may use a cloud model, vLLM, or Ollama. Generated filter values are bound as query parameters. A request performs one SQL generation and one execution; there is no automatic SQL repair or result-verifier loop.</w:t>
+      </w:r>
+    </w:p>
+    <w:p>
       <w:pPr>
         <w:pStyle w:val="Heading2"/>
       </w:pPr>
@@ -3402,6 +3564,19 @@
         <w:rPr>
           <w:rFonts w:ascii="Calibri" w:hAnsi="Calibri"/>
         </w:rPr>
+        <w:t xml:space="preserve">, </w:t>
+      </w:r>
+      <w:r>
+        <w:rPr>
+          <w:rFonts w:ascii="Calibri" w:hAnsi="Calibri"/>
+          <w:b/>
+        </w:rPr>
+        <w:t>Ingestion Controls</w:t>
+      </w:r>
+      <w:r>
+        <w:rPr>
+          <w:rFonts w:ascii="Calibri" w:hAnsi="Calibri"/>
+        </w:rPr>
         <w:t xml:space="preserve">, and </w:t>
       </w:r>
       <w:r>
@@ -3409,13 +3584,71 @@
           <w:rFonts w:ascii="Calibri" w:hAnsi="Calibri"/>
           <w:b/>
         </w:rPr>
-        <w:t>Ingestion Controls</w:t>
+        <w:t>Branding</w:t>
       </w:r>
       <w:r>
         <w:rPr>
           <w:rFonts w:ascii="Calibri" w:hAnsi="Calibri"/>
         </w:rPr>
         <w:t>.</w:t>
+      </w:r>
+    </w:p>
+    <w:p>
+      <w:pPr>
+        <w:pStyle w:val="Heading3"/>
+      </w:pPr>
+      <w:r>
+        <w:rPr>
+          <w:rFonts w:ascii="Calibri" w:hAnsi="Calibri"/>
+        </w:rPr>
+        <w:t>Branding</w:t>
+      </w:r>
+    </w:p>
+    <w:p>
+      <w:r>
+        <w:rPr>
+          <w:rFonts w:ascii="Calibri" w:hAnsi="Calibri"/>
+        </w:rPr>
+        <w:t xml:space="preserve">Use </w:t>
+      </w:r>
+      <w:r>
+        <w:rPr>
+          <w:rFonts w:ascii="Calibri" w:hAnsi="Calibri"/>
+          <w:b/>
+        </w:rPr>
+        <w:t>Branding</w:t>
+      </w:r>
+      <w:r>
+        <w:rPr>
+          <w:rFonts w:ascii="Calibri" w:hAnsi="Calibri"/>
+        </w:rPr>
+        <w:t xml:space="preserve"> to set the workspace application name, primary and accent colors, theme background tint, sign-in message, optional support URL, and a PNG or JPEG logo (up to 1 MB). You can let users choose their theme or force light or dark mode for the whole workspace. Choose compact, standard, or large presets for workspace H1, H2, and body text, with semibold, bold, or extra-bold heading weights. The live preview shows the selected colors, headings, body text, primary action, link, selected navigation, and keyboard focus treatment; it warns when primary or focus colors may be hard to see in dark mode. You can optionally set a separate color for H1 and H2, or keep either heading on its theme default. Changes apply immediately to the sign-in screen, navigation, page labels, assistant labels, browser title, and application icon. </w:t>
+      </w:r>
+      <w:r>
+        <w:rPr>
+          <w:rFonts w:ascii="Calibri" w:hAnsi="Calibri"/>
+          <w:b/>
+        </w:rPr>
+        <w:t>Use default logo</w:t>
+      </w:r>
+      <w:r>
+        <w:rPr>
+          <w:rFonts w:ascii="Calibri" w:hAnsi="Calibri"/>
+        </w:rPr>
+        <w:t xml:space="preserve"> removes only the custom logo; </w:t>
+      </w:r>
+      <w:r>
+        <w:rPr>
+          <w:rFonts w:ascii="Calibri" w:hAnsi="Calibri"/>
+          <w:b/>
+        </w:rPr>
+        <w:t>Restore defaults</w:t>
+      </w:r>
+      <w:r>
+        <w:rPr>
+          <w:rFonts w:ascii="Calibri" w:hAnsi="Calibri"/>
+        </w:rPr>
+        <w:t xml:space="preserve"> removes every workspace branding override. Each branding change is recorded in System Audit.</w:t>
       </w:r>
     </w:p>
     <w:p>
@@ -4167,7 +4400,7 @@
         <w:rPr>
           <w:rFonts w:ascii="Calibri" w:hAnsi="Calibri"/>
         </w:rPr>
-        <w:t xml:space="preserve"> to set worker concurrency, OCR review threshold, PDF image review threshold, vision layout repair, and graph-enrichment visibility for new ingestion jobs.</w:t>
+        <w:t xml:space="preserve"> to set worker concurrency, the browser-folder snapshot file limit, OCR review threshold, PDF image review threshold, vision layout repair, and graph-enrichment visibility for new ingestion jobs. Folder snapshots retain the separate 5 GB total-size limit.</w:t>
       </w:r>
     </w:p>
     <w:p>

</xml_diff>